<commit_message>
Terminada version inicial plan de pruebas de la historia de usuario Ver Informacion Detallada de Red de Bicicletas
</commit_message>
<xml_diff>
--- a/Docs/Test Plans/planPruebasVerDetallesRedBicicletas.docx
+++ b/Docs/Test Plans/planPruebasVerDetallesRedBicicletas.docx
@@ -153,15 +153,7 @@
         <w:spacing w:after="0" w:line="240" w:lineRule="auto"/>
       </w:pPr>
       <w:r>
-        <w:t>La aplicación calcula el número de empresas operadoras de la red a partir de la lista `</w:t>
-      </w:r>
-      <w:proofErr w:type="spellStart"/>
-      <w:r>
-        <w:t>company</w:t>
-      </w:r>
-      <w:proofErr w:type="spellEnd"/>
-      <w:r>
-        <w:t>`.</w:t>
+        <w:t>La aplicación calcula el número de empresas operadoras de la red a partir de la lista `company`.</w:t>
       </w:r>
     </w:p>
     <w:p>
@@ -193,15 +185,7 @@
         <w:spacing w:after="0" w:line="240" w:lineRule="auto"/>
       </w:pPr>
       <w:r>
-        <w:t>Se verifica que los datos mostrados son correctos y que el número de empresas operadoras coincide con la cantidad de elementos de la lista `</w:t>
-      </w:r>
-      <w:proofErr w:type="spellStart"/>
-      <w:r>
-        <w:t>company</w:t>
-      </w:r>
-      <w:proofErr w:type="spellEnd"/>
-      <w:r>
-        <w:t>`.</w:t>
+        <w:t>Se verifica que los datos mostrados son correctos y que el número de empresas operadoras coincide con la cantidad de elementos de la lista `company`.</w:t>
       </w:r>
     </w:p>
     <w:p>
@@ -303,15 +287,7 @@
         <w:spacing w:after="0" w:line="240" w:lineRule="auto"/>
       </w:pPr>
       <w:r>
-        <w:t>La aplicación calcula el número de empresas operadoras de la red a partir de la lista `</w:t>
-      </w:r>
-      <w:proofErr w:type="spellStart"/>
-      <w:r>
-        <w:t>company</w:t>
-      </w:r>
-      <w:proofErr w:type="spellEnd"/>
-      <w:r>
-        <w:t>`.</w:t>
+        <w:t>La aplicación calcula el número de empresas operadoras de la red a partir de la lista `company`.</w:t>
       </w:r>
     </w:p>
     <w:p>
@@ -327,15 +303,7 @@
         <w:spacing w:after="0" w:line="240" w:lineRule="auto"/>
       </w:pPr>
       <w:r>
-        <w:t xml:space="preserve">Se verifica que, para los </w:t>
-      </w:r>
-      <w:proofErr w:type="spellStart"/>
-      <w:r>
-        <w:t>los</w:t>
-      </w:r>
-      <w:proofErr w:type="spellEnd"/>
-      <w:r>
-        <w:t xml:space="preserve"> datos existentes, los valores mostrados son correctos.</w:t>
+        <w:t>Se verifica que, para los los datos existentes, los valores mostrados son correctos.</w:t>
       </w:r>
     </w:p>
     <w:p>
@@ -351,15 +319,7 @@
         <w:spacing w:after="0" w:line="240" w:lineRule="auto"/>
       </w:pPr>
       <w:r>
-        <w:t xml:space="preserve">Se verifica que para los datos no existentes se muestra un </w:t>
-      </w:r>
-      <w:proofErr w:type="spellStart"/>
-      <w:r>
-        <w:t>guión</w:t>
-      </w:r>
-      <w:proofErr w:type="spellEnd"/>
-      <w:r>
-        <w:t>, indicando que el dato no está disponible.</w:t>
+        <w:t>Se verifica que para los datos no existentes se muestra un guión, indicando que el dato no está disponible.</w:t>
       </w:r>
     </w:p>
     <w:p>
@@ -375,15 +335,7 @@
         <w:spacing w:after="0" w:line="240" w:lineRule="auto"/>
       </w:pPr>
       <w:r>
-        <w:t>Se verifica que el número de empresas colaboradoras solo se muestra si `</w:t>
-      </w:r>
-      <w:proofErr w:type="spellStart"/>
-      <w:r>
-        <w:t>company</w:t>
-      </w:r>
-      <w:proofErr w:type="spellEnd"/>
-      <w:r>
-        <w:t>` está disponible.</w:t>
+        <w:t>Se verifica que el número de empresas colaboradoras solo se muestra si `company` está disponible.</w:t>
       </w:r>
     </w:p>
     <w:p>
@@ -404,31 +356,7 @@
         <w:ind w:left="708"/>
       </w:pPr>
       <w:r>
-        <w:t>NOTA: La ausencia de `</w:t>
-      </w:r>
-      <w:proofErr w:type="spellStart"/>
-      <w:r>
-        <w:t>ebikes</w:t>
-      </w:r>
-      <w:proofErr w:type="spellEnd"/>
-      <w:r>
-        <w:t xml:space="preserve">` no debe interpretarse como que la red carece de bicicletas eléctricas, el </w:t>
-      </w:r>
-      <w:proofErr w:type="spellStart"/>
-      <w:r>
-        <w:t>guión</w:t>
-      </w:r>
-      <w:proofErr w:type="spellEnd"/>
-      <w:r>
-        <w:t xml:space="preserve"> indica que el dato no está disponible se muestra un </w:t>
-      </w:r>
-      <w:proofErr w:type="spellStart"/>
-      <w:r>
-        <w:t>guión</w:t>
-      </w:r>
-      <w:proofErr w:type="spellEnd"/>
-      <w:r>
-        <w:t>. Un valor `false` sí indica que no dispone de ellas.</w:t>
+        <w:t>NOTA: La ausencia de `ebikes` no debe interpretarse como que la red carece de bicicletas eléctricas, el guión indica que el dato no está disponible se muestra un guión. Un valor `false` sí indica que no dispone de ellas.</w:t>
       </w:r>
     </w:p>
     <w:p>
@@ -458,23 +386,7 @@
         <w:spacing w:after="0" w:line="240" w:lineRule="auto"/>
       </w:pPr>
       <w:r>
-        <w:t>Contexto: Uno o más datos tienen un formato o valor inválido. Por ejemplo, las coordenadas están fuera de los rangos válidos (latitud entre -90 y 90, longitud entre -180 y 180), `</w:t>
-      </w:r>
-      <w:proofErr w:type="spellStart"/>
-      <w:r>
-        <w:t>ebikes</w:t>
-      </w:r>
-      <w:proofErr w:type="spellEnd"/>
-      <w:r>
-        <w:t>` no es un valor booleano o la lista `</w:t>
-      </w:r>
-      <w:proofErr w:type="spellStart"/>
-      <w:r>
-        <w:t>company</w:t>
-      </w:r>
-      <w:proofErr w:type="spellEnd"/>
-      <w:r>
-        <w:t>` contiene elementos vacíos o que no son nombres de empresa.</w:t>
+        <w:t>Contexto: Uno o más datos tienen un formato o valor inválido. Por ejemplo, las coordenadas están fuera de los rangos válidos (latitud entre -90 y 90, longitud entre -180 y 180), `ebikes` no es un valor booleano o la lista `company` contiene elementos vacíos o que no son nombres de empresa.</w:t>
       </w:r>
     </w:p>
     <w:p>
@@ -530,15 +442,7 @@
         <w:spacing w:after="0" w:line="240" w:lineRule="auto"/>
       </w:pPr>
       <w:r>
-        <w:t>La aplicación calcula el número de empresas operadoras de la red a partir de la lista `</w:t>
-      </w:r>
-      <w:proofErr w:type="spellStart"/>
-      <w:r>
-        <w:t>company</w:t>
-      </w:r>
-      <w:proofErr w:type="spellEnd"/>
-      <w:r>
-        <w:t>`.</w:t>
+        <w:t>La aplicación calcula el número de empresas operadoras de la red a partir de la lista `company`.</w:t>
       </w:r>
     </w:p>
     <w:p>
@@ -570,15 +474,7 @@
         <w:spacing w:after="0" w:line="240" w:lineRule="auto"/>
       </w:pPr>
       <w:r>
-        <w:t xml:space="preserve">Se verifica que para los datos con valores anómalos se muestra un </w:t>
-      </w:r>
-      <w:proofErr w:type="spellStart"/>
-      <w:r>
-        <w:t>guión</w:t>
-      </w:r>
-      <w:proofErr w:type="spellEnd"/>
-      <w:r>
-        <w:t>, indicando que el dato no está disponible, ya que hay un problema con ellos.</w:t>
+        <w:t>Se verifica que para los datos con valores anómalos se muestra un guión, indicando que el dato no está disponible, ya que hay un problema con ellos.</w:t>
       </w:r>
     </w:p>
     <w:p>
@@ -595,15 +491,7 @@
       </w:pPr>
       <w:r>
         <w:lastRenderedPageBreak/>
-        <w:t>Se verifica que el cálculo del número de empresas colaboradoras solo se realiza si `</w:t>
-      </w:r>
-      <w:proofErr w:type="spellStart"/>
-      <w:r>
-        <w:t>company</w:t>
-      </w:r>
-      <w:proofErr w:type="spellEnd"/>
-      <w:r>
-        <w:t>` está disponible y definida como un array de elementos de tipo texto.</w:t>
+        <w:t>Se verifica que el cálculo del número de empresas colaboradoras solo se realiza si `company` está disponible y definida como un array de elementos de tipo texto.</w:t>
       </w:r>
     </w:p>
     <w:p>
@@ -755,42 +643,14 @@
           <w:u w:val="single"/>
         </w:rPr>
       </w:pPr>
-      <w:proofErr w:type="spellStart"/>
-      <w:r>
-        <w:t>Metodo</w:t>
-      </w:r>
-      <w:proofErr w:type="spellEnd"/>
-      <w:r>
-        <w:t xml:space="preserve"> </w:t>
-      </w:r>
-      <w:proofErr w:type="spellStart"/>
-      <w:proofErr w:type="gramStart"/>
-      <w:r>
-        <w:t>onCreate</w:t>
-      </w:r>
-      <w:proofErr w:type="spellEnd"/>
-      <w:r>
-        <w:t>(</w:t>
-      </w:r>
-      <w:proofErr w:type="gramEnd"/>
-      <w:r>
-        <w:t xml:space="preserve">) de la clase </w:t>
-      </w:r>
-      <w:proofErr w:type="spellStart"/>
+      <w:r>
+        <w:t xml:space="preserve">Metodo onCreate() de la clase </w:t>
+      </w:r>
       <w:r>
         <w:t>DetailsView</w:t>
       </w:r>
-      <w:proofErr w:type="spellEnd"/>
-      <w:r>
-        <w:t xml:space="preserve"> ya que ahora al crearse recoge la información de la red correspondiente y la asigna a los </w:t>
-      </w:r>
-      <w:proofErr w:type="spellStart"/>
-      <w:r>
-        <w:t>labels</w:t>
-      </w:r>
-      <w:proofErr w:type="spellEnd"/>
-      <w:r>
-        <w:t xml:space="preserve"> correspondientes para mostrarla</w:t>
+      <w:r>
+        <w:t xml:space="preserve"> ya que ahora al crearse recoge la información de la red correspondiente y la asigna a los labels correspondientes para mostrarla</w:t>
       </w:r>
     </w:p>
     <w:p>
@@ -845,7 +705,6 @@
       <w:r>
         <w:t xml:space="preserve">Método </w:t>
       </w:r>
-      <w:proofErr w:type="spellStart"/>
       <w:r>
         <w:t>on</w:t>
       </w:r>
@@ -853,17 +712,8 @@
         <w:t>C</w:t>
       </w:r>
       <w:r>
-        <w:t>reate</w:t>
-      </w:r>
-      <w:proofErr w:type="spellEnd"/>
-      <w:r>
-        <w:t xml:space="preserve"> de la clase </w:t>
-      </w:r>
-      <w:proofErr w:type="spellStart"/>
-      <w:r>
-        <w:t>DetailsView</w:t>
-      </w:r>
-      <w:proofErr w:type="spellEnd"/>
+        <w:t>reate de la clase DetailsView</w:t>
+      </w:r>
       <w:r>
         <w:t xml:space="preserve"> </w:t>
       </w:r>
@@ -944,6 +794,9 @@
               <w:ind w:left="0"/>
               <w:jc w:val="both"/>
             </w:pPr>
+            <w:r>
+              <w:t>PU-01</w:t>
+            </w:r>
           </w:p>
         </w:tc>
         <w:tc>
@@ -952,21 +805,8 @@
           </w:tcPr>
           <w:p>
             <w:r>
-              <w:t xml:space="preserve">Se hace </w:t>
-            </w:r>
-            <w:proofErr w:type="spellStart"/>
-            <w:r>
-              <w:t>click</w:t>
-            </w:r>
-            <w:proofErr w:type="spellEnd"/>
-            <w:r>
-              <w:t xml:space="preserve"> </w:t>
-            </w:r>
-            <w:proofErr w:type="spellStart"/>
-            <w:r>
-              <w:t>Bicing</w:t>
-            </w:r>
-            <w:proofErr w:type="spellEnd"/>
+              <w:t>Se hace click Bicing</w:t>
+            </w:r>
           </w:p>
           <w:p>
             <w:r>
@@ -986,13 +826,8 @@
           </w:tcPr>
           <w:p>
             <w:r>
-              <w:t>(Nombre)</w:t>
-            </w:r>
-            <w:proofErr w:type="spellStart"/>
-            <w:r>
-              <w:t>Bicing</w:t>
-            </w:r>
-            <w:proofErr w:type="spellEnd"/>
+              <w:t>(Nombre)Bicing</w:t>
+            </w:r>
             <w:r>
               <w:t>,</w:t>
             </w:r>
@@ -1010,15 +845,7 @@
           </w:p>
           <w:p>
             <w:r>
-              <w:t>(</w:t>
-            </w:r>
-            <w:proofErr w:type="spellStart"/>
-            <w:r>
-              <w:t>ebikes</w:t>
-            </w:r>
-            <w:proofErr w:type="spellEnd"/>
-            <w:r>
-              <w:t xml:space="preserve">) </w:t>
+              <w:t xml:space="preserve">(ebikes) </w:t>
             </w:r>
             <w:r>
               <w:t>true</w:t>
@@ -1029,15 +856,7 @@
           </w:p>
           <w:p>
             <w:r>
-              <w:t>(</w:t>
-            </w:r>
-            <w:proofErr w:type="spellStart"/>
-            <w:r>
-              <w:t>NºCompañias</w:t>
-            </w:r>
-            <w:proofErr w:type="spellEnd"/>
-            <w:r>
-              <w:t>) 3</w:t>
+              <w:t>(NºCompañias) 3</w:t>
             </w:r>
             <w:r>
               <w:t>,</w:t>
@@ -1045,39 +864,10 @@
           </w:p>
           <w:p>
             <w:r>
-              <w:t>(</w:t>
-            </w:r>
-            <w:proofErr w:type="spellStart"/>
-            <w:r>
-              <w:t>Compañias</w:t>
-            </w:r>
-            <w:proofErr w:type="spellEnd"/>
-            <w:r>
-              <w:t>) {</w:t>
-            </w:r>
-            <w:r>
-              <w:t xml:space="preserve">“Barcelona de </w:t>
-            </w:r>
-            <w:proofErr w:type="spellStart"/>
-            <w:r>
-              <w:t>Serveis</w:t>
-            </w:r>
-            <w:proofErr w:type="spellEnd"/>
-            <w:r>
-              <w:t xml:space="preserve"> </w:t>
-            </w:r>
-            <w:proofErr w:type="spellStart"/>
-            <w:proofErr w:type="gramStart"/>
-            <w:r>
-              <w:t>Municipals,S.A</w:t>
-            </w:r>
-            <w:proofErr w:type="spellEnd"/>
-            <w:r>
-              <w:t>.</w:t>
-            </w:r>
-            <w:proofErr w:type="gramEnd"/>
-            <w:r>
-              <w:t>(BSM)”,</w:t>
+              <w:t>(Compañias) {</w:t>
+            </w:r>
+            <w:r>
+              <w:t>“Barcelona de Serveis Municipals,S.A.(BSM)”,</w:t>
             </w:r>
           </w:p>
           <w:p>
@@ -1104,6 +894,12 @@
               <w:ind w:left="0"/>
               <w:jc w:val="both"/>
             </w:pPr>
+            <w:r>
+              <w:t>PU-0</w:t>
+            </w:r>
+            <w:r>
+              <w:t>2</w:t>
+            </w:r>
           </w:p>
         </w:tc>
         <w:tc>
@@ -1112,28 +908,18 @@
           </w:tcPr>
           <w:p>
             <w:r>
-              <w:t xml:space="preserve">Se hace </w:t>
-            </w:r>
-            <w:proofErr w:type="spellStart"/>
-            <w:r>
-              <w:t>click</w:t>
-            </w:r>
-            <w:proofErr w:type="spellEnd"/>
-            <w:r>
-              <w:t xml:space="preserve"> en </w:t>
-            </w:r>
-            <w:proofErr w:type="spellStart"/>
-            <w:r>
-              <w:t>TUeBICI</w:t>
-            </w:r>
-            <w:proofErr w:type="spellEnd"/>
+              <w:t>Se hace click en TUeBICI</w:t>
+            </w:r>
           </w:p>
           <w:p>
             <w:r>
               <w:t>(</w:t>
             </w:r>
             <w:r>
-              <w:t>Red sin compañías</w:t>
+              <w:t xml:space="preserve">Red sin </w:t>
+            </w:r>
+            <w:r>
+              <w:t>información detallada</w:t>
             </w:r>
             <w:r>
               <w:t>)</w:t>
@@ -1144,6 +930,39 @@
           <w:tcPr>
             <w:tcW w:w="5529" w:type="dxa"/>
           </w:tcPr>
+          <w:p>
+            <w:r>
+              <w:t>(Nombre)</w:t>
+            </w:r>
+            <w:r>
+              <w:t>TUeBICI</w:t>
+            </w:r>
+            <w:r>
+              <w:t>,</w:t>
+            </w:r>
+            <w:r>
+              <w:t xml:space="preserve"> </w:t>
+            </w:r>
+          </w:p>
+          <w:p>
+            <w:r>
+              <w:t>(Ciudad)</w:t>
+            </w:r>
+            <w:r>
+              <w:t>Santander</w:t>
+            </w:r>
+            <w:r>
+              <w:t xml:space="preserve">, </w:t>
+            </w:r>
+          </w:p>
+          <w:p>
+            <w:r>
+              <w:t>El resto de cam</w:t>
+            </w:r>
+            <w:r>
+              <w:t>pos se muestra un mensaje de “noData”</w:t>
+            </w:r>
+          </w:p>
           <w:p/>
         </w:tc>
       </w:tr>
@@ -1161,6 +980,12 @@
               <w:ind w:left="0"/>
               <w:jc w:val="both"/>
             </w:pPr>
+            <w:r>
+              <w:t>PU-0</w:t>
+            </w:r>
+            <w:r>
+              <w:t>3</w:t>
+            </w:r>
           </w:p>
         </w:tc>
         <w:tc>
@@ -1169,15 +994,7 @@
           </w:tcPr>
           <w:p>
             <w:r>
-              <w:t xml:space="preserve">Se hace </w:t>
-            </w:r>
-            <w:proofErr w:type="spellStart"/>
-            <w:r>
-              <w:t>click</w:t>
-            </w:r>
-            <w:proofErr w:type="spellEnd"/>
-            <w:r>
-              <w:t xml:space="preserve"> en cualquiera</w:t>
+              <w:t>Se hace click en cualquiera</w:t>
             </w:r>
           </w:p>
           <w:p>
@@ -1190,10 +1007,121 @@
           <w:tcPr>
             <w:tcW w:w="5529" w:type="dxa"/>
           </w:tcPr>
-          <w:p/>
+          <w:p>
+            <w:r>
+              <w:t xml:space="preserve">Se muestra un mensaje de error al </w:t>
+            </w:r>
+            <w:r>
+              <w:t>cargar la network</w:t>
+            </w:r>
+          </w:p>
+        </w:tc>
+      </w:tr>
+      <w:tr>
+        <w:trPr>
+          <w:jc w:val="center"/>
+        </w:trPr>
+        <w:tc>
+          <w:tcPr>
+            <w:tcW w:w="1499" w:type="dxa"/>
+          </w:tcPr>
+          <w:p>
+            <w:pPr>
+              <w:pStyle w:val="Prrafodelista"/>
+              <w:ind w:left="0"/>
+              <w:jc w:val="both"/>
+            </w:pPr>
+            <w:r>
+              <w:t>PU-0</w:t>
+            </w:r>
+            <w:r>
+              <w:t>4</w:t>
+            </w:r>
+          </w:p>
+        </w:tc>
+        <w:tc>
+          <w:tcPr>
+            <w:tcW w:w="2465" w:type="dxa"/>
+          </w:tcPr>
+          <w:p>
+            <w:r>
+              <w:t xml:space="preserve">Se </w:t>
+            </w:r>
+            <w:r>
+              <w:t xml:space="preserve">hace click en </w:t>
+            </w:r>
+            <w:r>
+              <w:t>BiciMAD</w:t>
+            </w:r>
+          </w:p>
+          <w:p>
+            <w:r>
+              <w:t>(Datos Incosistentes,</w:t>
+            </w:r>
+            <w:r>
+              <w:t xml:space="preserve"> ebikes no es booleano</w:t>
+            </w:r>
+            <w:r>
+              <w:t>)</w:t>
+            </w:r>
+          </w:p>
+        </w:tc>
+        <w:tc>
+          <w:tcPr>
+            <w:tcW w:w="5529" w:type="dxa"/>
+          </w:tcPr>
+          <w:p>
+            <w:r>
+              <w:t xml:space="preserve">Los campos se muestran </w:t>
+            </w:r>
+            <w:r>
+              <w:t>correctos,</w:t>
+            </w:r>
+            <w:r>
+              <w:t xml:space="preserve"> pero en el lugar de lo</w:t>
+            </w:r>
+            <w:r>
+              <w:t xml:space="preserve">s datos </w:t>
+            </w:r>
+            <w:r>
+              <w:t>inconsistentes</w:t>
+            </w:r>
+            <w:r>
+              <w:t xml:space="preserve"> se muestra “-“</w:t>
+            </w:r>
+          </w:p>
         </w:tc>
       </w:tr>
     </w:tbl>
+    <w:p>
+      <w:pPr>
+        <w:spacing w:after="120"/>
+        <w:jc w:val="both"/>
+      </w:pPr>
+    </w:p>
+    <w:p>
+      <w:pPr>
+        <w:spacing w:after="120"/>
+        <w:jc w:val="both"/>
+      </w:pPr>
+    </w:p>
+    <w:p>
+      <w:pPr>
+        <w:spacing w:after="120"/>
+        <w:jc w:val="both"/>
+        <w:rPr>
+          <w:b/>
+          <w:u w:val="single"/>
+        </w:rPr>
+      </w:pPr>
+      <w:r>
+        <w:rPr>
+          <w:b/>
+          <w:u w:val="single"/>
+        </w:rPr>
+        <w:t>Informe de la pruebas realizadas:</w:t>
+      </w:r>
+    </w:p>
     <w:p>
       <w:pPr>
         <w:spacing w:after="120"/>
@@ -1385,15 +1313,7 @@
       </w:pBdr>
     </w:pPr>
     <w:r>
-      <w:t xml:space="preserve">Estructura de Datos y Algoritmos </w:t>
-    </w:r>
-    <w:proofErr w:type="gramStart"/>
-    <w:r>
-      <w:t>–  Práctica</w:t>
-    </w:r>
-    <w:proofErr w:type="gramEnd"/>
-    <w:r>
-      <w:t xml:space="preserve"> 3</w:t>
+      <w:t>Estructura de Datos y Algoritmos –  Práctica 3</w:t>
     </w:r>
   </w:p>
 </w:hdr>
@@ -1522,13 +1442,8 @@
           <w:pPr>
             <w:spacing w:after="0" w:line="240" w:lineRule="auto"/>
           </w:pPr>
-          <w:proofErr w:type="gramStart"/>
           <w:r>
-            <w:t>4º  Grado</w:t>
-          </w:r>
-          <w:proofErr w:type="gramEnd"/>
-          <w:r>
-            <w:t xml:space="preserve"> en Ing. Informática</w:t>
+            <w:t>4º  Grado en Ing. Informática</w:t>
           </w:r>
         </w:p>
         <w:p>
@@ -2492,7 +2407,7 @@
   <w:style w:type="paragraph" w:default="1" w:styleId="Normal">
     <w:name w:val="Normal"/>
     <w:qFormat/>
-    <w:rsid w:val="00234B59"/>
+    <w:rsid w:val="001150C7"/>
     <w:rPr>
       <w:rFonts w:ascii="Calibri" w:eastAsia="Calibri" w:hAnsi="Calibri" w:cs="Times New Roman"/>
     </w:rPr>

</xml_diff>

<commit_message>
Arreglados test añadido informe a plan de pruebas
</commit_message>
<xml_diff>
--- a/Docs/Test Plans/planPruebasVerDetallesRedBicicletas.docx
+++ b/Docs/Test Plans/planPruebasVerDetallesRedBicicletas.docx
@@ -895,10 +895,7 @@
               <w:jc w:val="both"/>
             </w:pPr>
             <w:r>
-              <w:t>PU-0</w:t>
-            </w:r>
-            <w:r>
-              <w:t>2</w:t>
+              <w:t>PU-02</w:t>
             </w:r>
           </w:p>
         </w:tc>
@@ -981,10 +978,7 @@
               <w:jc w:val="both"/>
             </w:pPr>
             <w:r>
-              <w:t>PU-0</w:t>
-            </w:r>
-            <w:r>
-              <w:t>3</w:t>
+              <w:t>PU-03</w:t>
             </w:r>
           </w:p>
         </w:tc>
@@ -1032,10 +1026,7 @@
               <w:jc w:val="both"/>
             </w:pPr>
             <w:r>
-              <w:t>PU-0</w:t>
-            </w:r>
-            <w:r>
-              <w:t>4</w:t>
+              <w:t>PU-04</w:t>
             </w:r>
           </w:p>
         </w:tc>
@@ -1127,6 +1118,9 @@
         <w:spacing w:after="120"/>
         <w:jc w:val="both"/>
       </w:pPr>
+      <w:r>
+        <w:t>Detectada en la prueba unitaria PU-03 la falta de un toast con mensaje de error de red, todas las demás pruebas unitarias pasan sin problema.</w:t>
+      </w:r>
     </w:p>
     <w:sectPr>
       <w:headerReference w:type="even" r:id="rId8"/>
@@ -1183,7 +1177,6 @@
           <w:docPartUnique/>
         </w:docPartObj>
       </w:sdtPr>
-      <w:sdtEndPr/>
       <w:sdtContent>
         <w:r>
           <w:t>-</w:t>
@@ -1241,7 +1234,6 @@
           <w:docPartUnique/>
         </w:docPartObj>
       </w:sdtPr>
-      <w:sdtEndPr/>
       <w:sdtContent>
         <w:r>
           <w:fldChar w:fldCharType="begin"/>

</xml_diff>

<commit_message>
Modificado el plan de pruebas
</commit_message>
<xml_diff>
--- a/Docs/Test Plans/planPruebasVerDetallesRedBicicletas.docx
+++ b/Docs/Test Plans/planPruebasVerDetallesRedBicicletas.docx
@@ -153,7 +153,15 @@
         <w:spacing w:after="0" w:line="240" w:lineRule="auto"/>
       </w:pPr>
       <w:r>
-        <w:t>La aplicación calcula el número de empresas operadoras de la red a partir de la lista `company`.</w:t>
+        <w:t>La aplicación calcula el número de empresas operadoras de la red a partir de la lista `</w:t>
+      </w:r>
+      <w:proofErr w:type="spellStart"/>
+      <w:r>
+        <w:t>company</w:t>
+      </w:r>
+      <w:proofErr w:type="spellEnd"/>
+      <w:r>
+        <w:t>`.</w:t>
       </w:r>
     </w:p>
     <w:p>
@@ -185,7 +193,15 @@
         <w:spacing w:after="0" w:line="240" w:lineRule="auto"/>
       </w:pPr>
       <w:r>
-        <w:t>Se verifica que los datos mostrados son correctos y que el número de empresas operadoras coincide con la cantidad de elementos de la lista `company`.</w:t>
+        <w:t>Se verifica que los datos mostrados son correctos y que el número de empresas operadoras coincide con la cantidad de elementos de la lista `</w:t>
+      </w:r>
+      <w:proofErr w:type="spellStart"/>
+      <w:r>
+        <w:t>company</w:t>
+      </w:r>
+      <w:proofErr w:type="spellEnd"/>
+      <w:r>
+        <w:t>`.</w:t>
       </w:r>
     </w:p>
     <w:p>
@@ -287,7 +303,15 @@
         <w:spacing w:after="0" w:line="240" w:lineRule="auto"/>
       </w:pPr>
       <w:r>
-        <w:t>La aplicación calcula el número de empresas operadoras de la red a partir de la lista `company`.</w:t>
+        <w:t>La aplicación calcula el número de empresas operadoras de la red a partir de la lista `</w:t>
+      </w:r>
+      <w:proofErr w:type="spellStart"/>
+      <w:r>
+        <w:t>company</w:t>
+      </w:r>
+      <w:proofErr w:type="spellEnd"/>
+      <w:r>
+        <w:t>`.</w:t>
       </w:r>
     </w:p>
     <w:p>
@@ -303,7 +327,15 @@
         <w:spacing w:after="0" w:line="240" w:lineRule="auto"/>
       </w:pPr>
       <w:r>
-        <w:t>Se verifica que, para los los datos existentes, los valores mostrados son correctos.</w:t>
+        <w:t xml:space="preserve">Se verifica que, para los </w:t>
+      </w:r>
+      <w:proofErr w:type="spellStart"/>
+      <w:r>
+        <w:t>los</w:t>
+      </w:r>
+      <w:proofErr w:type="spellEnd"/>
+      <w:r>
+        <w:t xml:space="preserve"> datos existentes, los valores mostrados son correctos.</w:t>
       </w:r>
     </w:p>
     <w:p>
@@ -319,7 +351,15 @@
         <w:spacing w:after="0" w:line="240" w:lineRule="auto"/>
       </w:pPr>
       <w:r>
-        <w:t>Se verifica que para los datos no existentes se muestra un guión, indicando que el dato no está disponible.</w:t>
+        <w:t xml:space="preserve">Se verifica que para los datos no existentes se muestra un </w:t>
+      </w:r>
+      <w:proofErr w:type="spellStart"/>
+      <w:r>
+        <w:t>guión</w:t>
+      </w:r>
+      <w:proofErr w:type="spellEnd"/>
+      <w:r>
+        <w:t>, indicando que el dato no está disponible.</w:t>
       </w:r>
     </w:p>
     <w:p>
@@ -335,7 +375,15 @@
         <w:spacing w:after="0" w:line="240" w:lineRule="auto"/>
       </w:pPr>
       <w:r>
-        <w:t>Se verifica que el número de empresas colaboradoras solo se muestra si `company` está disponible.</w:t>
+        <w:t>Se verifica que el número de empresas colaboradoras solo se muestra si `</w:t>
+      </w:r>
+      <w:proofErr w:type="spellStart"/>
+      <w:r>
+        <w:t>company</w:t>
+      </w:r>
+      <w:proofErr w:type="spellEnd"/>
+      <w:r>
+        <w:t>` está disponible.</w:t>
       </w:r>
     </w:p>
     <w:p>
@@ -356,7 +404,31 @@
         <w:ind w:left="708"/>
       </w:pPr>
       <w:r>
-        <w:t>NOTA: La ausencia de `ebikes` no debe interpretarse como que la red carece de bicicletas eléctricas, el guión indica que el dato no está disponible se muestra un guión. Un valor `false` sí indica que no dispone de ellas.</w:t>
+        <w:t>NOTA: La ausencia de `</w:t>
+      </w:r>
+      <w:proofErr w:type="spellStart"/>
+      <w:r>
+        <w:t>ebikes</w:t>
+      </w:r>
+      <w:proofErr w:type="spellEnd"/>
+      <w:r>
+        <w:t xml:space="preserve">` no debe interpretarse como que la red carece de bicicletas eléctricas, el </w:t>
+      </w:r>
+      <w:proofErr w:type="spellStart"/>
+      <w:r>
+        <w:t>guión</w:t>
+      </w:r>
+      <w:proofErr w:type="spellEnd"/>
+      <w:r>
+        <w:t xml:space="preserve"> indica que el dato no está disponible se muestra un </w:t>
+      </w:r>
+      <w:proofErr w:type="spellStart"/>
+      <w:r>
+        <w:t>guión</w:t>
+      </w:r>
+      <w:proofErr w:type="spellEnd"/>
+      <w:r>
+        <w:t>. Un valor `false` sí indica que no dispone de ellas.</w:t>
       </w:r>
     </w:p>
     <w:p>
@@ -386,7 +458,23 @@
         <w:spacing w:after="0" w:line="240" w:lineRule="auto"/>
       </w:pPr>
       <w:r>
-        <w:t>Contexto: Uno o más datos tienen un formato o valor inválido. Por ejemplo, las coordenadas están fuera de los rangos válidos (latitud entre -90 y 90, longitud entre -180 y 180), `ebikes` no es un valor booleano o la lista `company` contiene elementos vacíos o que no son nombres de empresa.</w:t>
+        <w:t>Contexto: Uno o más datos tienen un formato o valor inválido. Por ejemplo, las coordenadas están fuera de los rangos válidos (latitud entre -90 y 90, longitud entre -180 y 180), `</w:t>
+      </w:r>
+      <w:proofErr w:type="spellStart"/>
+      <w:r>
+        <w:t>ebikes</w:t>
+      </w:r>
+      <w:proofErr w:type="spellEnd"/>
+      <w:r>
+        <w:t>` no es un valor booleano o la lista `</w:t>
+      </w:r>
+      <w:proofErr w:type="spellStart"/>
+      <w:r>
+        <w:t>company</w:t>
+      </w:r>
+      <w:proofErr w:type="spellEnd"/>
+      <w:r>
+        <w:t>` contiene elementos vacíos o que no son nombres de empresa.</w:t>
       </w:r>
     </w:p>
     <w:p>
@@ -442,7 +530,15 @@
         <w:spacing w:after="0" w:line="240" w:lineRule="auto"/>
       </w:pPr>
       <w:r>
-        <w:t>La aplicación calcula el número de empresas operadoras de la red a partir de la lista `company`.</w:t>
+        <w:t>La aplicación calcula el número de empresas operadoras de la red a partir de la lista `</w:t>
+      </w:r>
+      <w:proofErr w:type="spellStart"/>
+      <w:r>
+        <w:t>company</w:t>
+      </w:r>
+      <w:proofErr w:type="spellEnd"/>
+      <w:r>
+        <w:t>`.</w:t>
       </w:r>
     </w:p>
     <w:p>
@@ -474,7 +570,15 @@
         <w:spacing w:after="0" w:line="240" w:lineRule="auto"/>
       </w:pPr>
       <w:r>
-        <w:t>Se verifica que para los datos con valores anómalos se muestra un guión, indicando que el dato no está disponible, ya que hay un problema con ellos.</w:t>
+        <w:t xml:space="preserve">Se verifica que para los datos con valores anómalos se muestra un </w:t>
+      </w:r>
+      <w:proofErr w:type="spellStart"/>
+      <w:r>
+        <w:t>guión</w:t>
+      </w:r>
+      <w:proofErr w:type="spellEnd"/>
+      <w:r>
+        <w:t>, indicando que el dato no está disponible, ya que hay un problema con ellos.</w:t>
       </w:r>
     </w:p>
     <w:p>
@@ -491,7 +595,15 @@
       </w:pPr>
       <w:r>
         <w:lastRenderedPageBreak/>
-        <w:t>Se verifica que el cálculo del número de empresas colaboradoras solo se realiza si `company` está disponible y definida como un array de elementos de tipo texto.</w:t>
+        <w:t>Se verifica que el cálculo del número de empresas colaboradoras solo se realiza si `</w:t>
+      </w:r>
+      <w:proofErr w:type="spellStart"/>
+      <w:r>
+        <w:t>company</w:t>
+      </w:r>
+      <w:proofErr w:type="spellEnd"/>
+      <w:r>
+        <w:t>` está disponible y definida como un array de elementos de tipo texto.</w:t>
       </w:r>
     </w:p>
     <w:p>
@@ -643,14 +755,37 @@
           <w:u w:val="single"/>
         </w:rPr>
       </w:pPr>
-      <w:r>
-        <w:t xml:space="preserve">Metodo onCreate() de la clase </w:t>
-      </w:r>
+      <w:proofErr w:type="spellStart"/>
+      <w:r>
+        <w:t>Metodo</w:t>
+      </w:r>
+      <w:proofErr w:type="spellEnd"/>
+      <w:r>
+        <w:t xml:space="preserve"> </w:t>
+      </w:r>
+      <w:proofErr w:type="spellStart"/>
+      <w:r>
+        <w:t>onCreate</w:t>
+      </w:r>
+      <w:proofErr w:type="spellEnd"/>
+      <w:r>
+        <w:t xml:space="preserve">() de la clase </w:t>
+      </w:r>
+      <w:proofErr w:type="spellStart"/>
       <w:r>
         <w:t>DetailsView</w:t>
       </w:r>
-      <w:r>
-        <w:t xml:space="preserve"> ya que ahora al crearse recoge la información de la red correspondiente y la asigna a los labels correspondientes para mostrarla</w:t>
+      <w:proofErr w:type="spellEnd"/>
+      <w:r>
+        <w:t xml:space="preserve"> ya que ahora al crearse recoge la información de la red correspondiente y la asigna a los </w:t>
+      </w:r>
+      <w:proofErr w:type="spellStart"/>
+      <w:r>
+        <w:t>labels</w:t>
+      </w:r>
+      <w:proofErr w:type="spellEnd"/>
+      <w:r>
+        <w:t xml:space="preserve"> correspondientes para mostrarla</w:t>
       </w:r>
     </w:p>
     <w:p>
@@ -705,6 +840,7 @@
       <w:r>
         <w:t xml:space="preserve">Método </w:t>
       </w:r>
+      <w:proofErr w:type="spellStart"/>
       <w:r>
         <w:t>on</w:t>
       </w:r>
@@ -712,8 +848,17 @@
         <w:t>C</w:t>
       </w:r>
       <w:r>
-        <w:t>reate de la clase DetailsView</w:t>
-      </w:r>
+        <w:t>reate</w:t>
+      </w:r>
+      <w:proofErr w:type="spellEnd"/>
+      <w:r>
+        <w:t xml:space="preserve"> de la clase </w:t>
+      </w:r>
+      <w:proofErr w:type="spellStart"/>
+      <w:r>
+        <w:t>DetailsView</w:t>
+      </w:r>
+      <w:proofErr w:type="spellEnd"/>
       <w:r>
         <w:t xml:space="preserve"> </w:t>
       </w:r>
@@ -805,8 +950,21 @@
           </w:tcPr>
           <w:p>
             <w:r>
-              <w:t>Se hace click Bicing</w:t>
-            </w:r>
+              <w:t xml:space="preserve">Se hace </w:t>
+            </w:r>
+            <w:proofErr w:type="spellStart"/>
+            <w:r>
+              <w:t>click</w:t>
+            </w:r>
+            <w:proofErr w:type="spellEnd"/>
+            <w:r>
+              <w:t xml:space="preserve"> </w:t>
+            </w:r>
+            <w:proofErr w:type="spellStart"/>
+            <w:r>
+              <w:t>Bicing</w:t>
+            </w:r>
+            <w:proofErr w:type="spellEnd"/>
           </w:p>
           <w:p>
             <w:r>
@@ -826,8 +984,13 @@
           </w:tcPr>
           <w:p>
             <w:r>
-              <w:t>(Nombre)Bicing</w:t>
-            </w:r>
+              <w:t>(Nombre)</w:t>
+            </w:r>
+            <w:proofErr w:type="spellStart"/>
+            <w:r>
+              <w:t>Bicing</w:t>
+            </w:r>
+            <w:proofErr w:type="spellEnd"/>
             <w:r>
               <w:t>,</w:t>
             </w:r>
@@ -845,7 +1008,15 @@
           </w:p>
           <w:p>
             <w:r>
-              <w:t xml:space="preserve">(ebikes) </w:t>
+              <w:t>(</w:t>
+            </w:r>
+            <w:proofErr w:type="spellStart"/>
+            <w:r>
+              <w:t>ebikes</w:t>
+            </w:r>
+            <w:proofErr w:type="spellEnd"/>
+            <w:r>
+              <w:t xml:space="preserve">) </w:t>
             </w:r>
             <w:r>
               <w:t>true</w:t>
@@ -856,7 +1027,15 @@
           </w:p>
           <w:p>
             <w:r>
-              <w:t>(NºCompañias) 3</w:t>
+              <w:t>(</w:t>
+            </w:r>
+            <w:proofErr w:type="spellStart"/>
+            <w:r>
+              <w:t>NºCompañias</w:t>
+            </w:r>
+            <w:proofErr w:type="spellEnd"/>
+            <w:r>
+              <w:t>) 3</w:t>
             </w:r>
             <w:r>
               <w:t>,</w:t>
@@ -864,10 +1043,34 @@
           </w:p>
           <w:p>
             <w:r>
-              <w:t>(Compañias) {</w:t>
-            </w:r>
-            <w:r>
-              <w:t>“Barcelona de Serveis Municipals,S.A.(BSM)”,</w:t>
+              <w:t>(</w:t>
+            </w:r>
+            <w:proofErr w:type="spellStart"/>
+            <w:r>
+              <w:t>Compañias</w:t>
+            </w:r>
+            <w:proofErr w:type="spellEnd"/>
+            <w:r>
+              <w:t>) {</w:t>
+            </w:r>
+            <w:r>
+              <w:t xml:space="preserve">“Barcelona de </w:t>
+            </w:r>
+            <w:proofErr w:type="spellStart"/>
+            <w:r>
+              <w:t>Serveis</w:t>
+            </w:r>
+            <w:proofErr w:type="spellEnd"/>
+            <w:r>
+              <w:t xml:space="preserve"> </w:t>
+            </w:r>
+            <w:proofErr w:type="spellStart"/>
+            <w:r>
+              <w:t>Municipals,S.A</w:t>
+            </w:r>
+            <w:proofErr w:type="spellEnd"/>
+            <w:r>
+              <w:t>.(BSM)”,</w:t>
             </w:r>
           </w:p>
           <w:p>
@@ -905,8 +1108,21 @@
           </w:tcPr>
           <w:p>
             <w:r>
-              <w:t>Se hace click en TUeBICI</w:t>
-            </w:r>
+              <w:t xml:space="preserve">Se hace </w:t>
+            </w:r>
+            <w:proofErr w:type="spellStart"/>
+            <w:r>
+              <w:t>click</w:t>
+            </w:r>
+            <w:proofErr w:type="spellEnd"/>
+            <w:r>
+              <w:t xml:space="preserve"> en </w:t>
+            </w:r>
+            <w:proofErr w:type="spellStart"/>
+            <w:r>
+              <w:t>TUeBICI</w:t>
+            </w:r>
+            <w:proofErr w:type="spellEnd"/>
           </w:p>
           <w:p>
             <w:r>
@@ -931,9 +1147,11 @@
             <w:r>
               <w:t>(Nombre)</w:t>
             </w:r>
+            <w:proofErr w:type="spellStart"/>
             <w:r>
               <w:t>TUeBICI</w:t>
             </w:r>
+            <w:proofErr w:type="spellEnd"/>
             <w:r>
               <w:t>,</w:t>
             </w:r>
@@ -957,7 +1175,15 @@
               <w:t>El resto de cam</w:t>
             </w:r>
             <w:r>
-              <w:t>pos se muestra un mensaje de “noData”</w:t>
+              <w:t>pos se muestra un mensaje de “</w:t>
+            </w:r>
+            <w:proofErr w:type="spellStart"/>
+            <w:r>
+              <w:t>noData</w:t>
+            </w:r>
+            <w:proofErr w:type="spellEnd"/>
+            <w:r>
+              <w:t>”</w:t>
             </w:r>
           </w:p>
           <w:p/>
@@ -988,7 +1214,15 @@
           </w:tcPr>
           <w:p>
             <w:r>
-              <w:t>Se hace click en cualquiera</w:t>
+              <w:t xml:space="preserve">Se hace </w:t>
+            </w:r>
+            <w:proofErr w:type="spellStart"/>
+            <w:r>
+              <w:t>click</w:t>
+            </w:r>
+            <w:proofErr w:type="spellEnd"/>
+            <w:r>
+              <w:t xml:space="preserve"> en cualquiera</w:t>
             </w:r>
           </w:p>
           <w:p>
@@ -1006,8 +1240,13 @@
               <w:t xml:space="preserve">Se muestra un mensaje de error al </w:t>
             </w:r>
             <w:r>
-              <w:t>cargar la network</w:t>
-            </w:r>
+              <w:t xml:space="preserve">cargar la </w:t>
+            </w:r>
+            <w:proofErr w:type="spellStart"/>
+            <w:r>
+              <w:t>network</w:t>
+            </w:r>
+            <w:proofErr w:type="spellEnd"/>
           </w:p>
         </w:tc>
       </w:tr>
@@ -1039,18 +1278,44 @@
               <w:t xml:space="preserve">Se </w:t>
             </w:r>
             <w:r>
-              <w:t xml:space="preserve">hace click en </w:t>
-            </w:r>
+              <w:t xml:space="preserve">hace </w:t>
+            </w:r>
+            <w:proofErr w:type="spellStart"/>
+            <w:r>
+              <w:t>click</w:t>
+            </w:r>
+            <w:proofErr w:type="spellEnd"/>
+            <w:r>
+              <w:t xml:space="preserve"> en </w:t>
+            </w:r>
+            <w:proofErr w:type="spellStart"/>
             <w:r>
               <w:t>BiciMAD</w:t>
             </w:r>
+            <w:proofErr w:type="spellEnd"/>
           </w:p>
           <w:p>
             <w:r>
-              <w:t>(Datos Incosistentes,</w:t>
-            </w:r>
-            <w:r>
-              <w:t xml:space="preserve"> ebikes no es booleano</w:t>
+              <w:t xml:space="preserve">(Datos </w:t>
+            </w:r>
+            <w:proofErr w:type="spellStart"/>
+            <w:r>
+              <w:t>Incosistentes</w:t>
+            </w:r>
+            <w:proofErr w:type="spellEnd"/>
+            <w:r>
+              <w:t>,</w:t>
+            </w:r>
+            <w:r>
+              <w:t xml:space="preserve"> </w:t>
+            </w:r>
+            <w:proofErr w:type="spellStart"/>
+            <w:r>
+              <w:t>ebikes</w:t>
+            </w:r>
+            <w:proofErr w:type="spellEnd"/>
+            <w:r>
+              <w:t xml:space="preserve"> no es booleano</w:t>
             </w:r>
             <w:r>
               <w:t>)</w:t>
@@ -1119,8 +1384,37 @@
         <w:jc w:val="both"/>
       </w:pPr>
       <w:r>
-        <w:t>Detectada en la prueba unitaria PU-03 la falta de un toast con mensaje de error de red, todas las demás pruebas unitarias pasan sin problema.</w:t>
-      </w:r>
+        <w:t xml:space="preserve">Detectada en la prueba unitaria PU-03 la falta de un </w:t>
+      </w:r>
+      <w:proofErr w:type="spellStart"/>
+      <w:r>
+        <w:t>toast</w:t>
+      </w:r>
+      <w:proofErr w:type="spellEnd"/>
+      <w:r>
+        <w:t xml:space="preserve"> con mensaje de error de red, todas las demás pruebas unitarias pasan sin problema.</w:t>
+      </w:r>
+    </w:p>
+    <w:p>
+      <w:pPr>
+        <w:spacing w:after="120"/>
+        <w:jc w:val="both"/>
+      </w:pPr>
+      <w:r>
+        <w:t>No se han detectado fallos en las pruebas de integración.</w:t>
+      </w:r>
+    </w:p>
+    <w:p>
+      <w:pPr>
+        <w:spacing w:after="120"/>
+        <w:jc w:val="both"/>
+      </w:pPr>
+    </w:p>
+    <w:p>
+      <w:pPr>
+        <w:spacing w:after="120"/>
+        <w:jc w:val="both"/>
+      </w:pPr>
     </w:p>
     <w:sectPr>
       <w:headerReference w:type="even" r:id="rId8"/>
@@ -2454,7 +2748,6 @@
   <w:style w:type="character" w:default="1" w:styleId="Fuentedeprrafopredeter">
     <w:name w:val="Default Paragraph Font"/>
     <w:uiPriority w:val="1"/>
-    <w:semiHidden/>
     <w:unhideWhenUsed/>
   </w:style>
   <w:style w:type="table" w:default="1" w:styleId="Tablanormal">

</xml_diff>

<commit_message>
Añadido resutado pruebas GUI a plan de pruebas
</commit_message>
<xml_diff>
--- a/Docs/Test Plans/planPruebasVerDetallesRedBicicletas.docx
+++ b/Docs/Test Plans/planPruebasVerDetallesRedBicicletas.docx
@@ -153,15 +153,7 @@
         <w:spacing w:after="0" w:line="240" w:lineRule="auto"/>
       </w:pPr>
       <w:r>
-        <w:t>La aplicación calcula el número de empresas operadoras de la red a partir de la lista `</w:t>
-      </w:r>
-      <w:proofErr w:type="spellStart"/>
-      <w:r>
-        <w:t>company</w:t>
-      </w:r>
-      <w:proofErr w:type="spellEnd"/>
-      <w:r>
-        <w:t>`.</w:t>
+        <w:t>La aplicación calcula el número de empresas operadoras de la red a partir de la lista `company`.</w:t>
       </w:r>
     </w:p>
     <w:p>
@@ -193,15 +185,7 @@
         <w:spacing w:after="0" w:line="240" w:lineRule="auto"/>
       </w:pPr>
       <w:r>
-        <w:t>Se verifica que los datos mostrados son correctos y que el número de empresas operadoras coincide con la cantidad de elementos de la lista `</w:t>
-      </w:r>
-      <w:proofErr w:type="spellStart"/>
-      <w:r>
-        <w:t>company</w:t>
-      </w:r>
-      <w:proofErr w:type="spellEnd"/>
-      <w:r>
-        <w:t>`.</w:t>
+        <w:t>Se verifica que los datos mostrados son correctos y que el número de empresas operadoras coincide con la cantidad de elementos de la lista `company`.</w:t>
       </w:r>
     </w:p>
     <w:p>
@@ -303,15 +287,7 @@
         <w:spacing w:after="0" w:line="240" w:lineRule="auto"/>
       </w:pPr>
       <w:r>
-        <w:t>La aplicación calcula el número de empresas operadoras de la red a partir de la lista `</w:t>
-      </w:r>
-      <w:proofErr w:type="spellStart"/>
-      <w:r>
-        <w:t>company</w:t>
-      </w:r>
-      <w:proofErr w:type="spellEnd"/>
-      <w:r>
-        <w:t>`.</w:t>
+        <w:t>La aplicación calcula el número de empresas operadoras de la red a partir de la lista `company`.</w:t>
       </w:r>
     </w:p>
     <w:p>
@@ -327,15 +303,7 @@
         <w:spacing w:after="0" w:line="240" w:lineRule="auto"/>
       </w:pPr>
       <w:r>
-        <w:t xml:space="preserve">Se verifica que, para los </w:t>
-      </w:r>
-      <w:proofErr w:type="spellStart"/>
-      <w:r>
-        <w:t>los</w:t>
-      </w:r>
-      <w:proofErr w:type="spellEnd"/>
-      <w:r>
-        <w:t xml:space="preserve"> datos existentes, los valores mostrados son correctos.</w:t>
+        <w:t>Se verifica que, para los los datos existentes, los valores mostrados son correctos.</w:t>
       </w:r>
     </w:p>
     <w:p>
@@ -351,15 +319,7 @@
         <w:spacing w:after="0" w:line="240" w:lineRule="auto"/>
       </w:pPr>
       <w:r>
-        <w:t xml:space="preserve">Se verifica que para los datos no existentes se muestra un </w:t>
-      </w:r>
-      <w:proofErr w:type="spellStart"/>
-      <w:r>
-        <w:t>guión</w:t>
-      </w:r>
-      <w:proofErr w:type="spellEnd"/>
-      <w:r>
-        <w:t>, indicando que el dato no está disponible.</w:t>
+        <w:t>Se verifica que para los datos no existentes se muestra un guión, indicando que el dato no está disponible.</w:t>
       </w:r>
     </w:p>
     <w:p>
@@ -375,15 +335,7 @@
         <w:spacing w:after="0" w:line="240" w:lineRule="auto"/>
       </w:pPr>
       <w:r>
-        <w:t>Se verifica que el número de empresas colaboradoras solo se muestra si `</w:t>
-      </w:r>
-      <w:proofErr w:type="spellStart"/>
-      <w:r>
-        <w:t>company</w:t>
-      </w:r>
-      <w:proofErr w:type="spellEnd"/>
-      <w:r>
-        <w:t>` está disponible.</w:t>
+        <w:t>Se verifica que el número de empresas colaboradoras solo se muestra si `company` está disponible.</w:t>
       </w:r>
     </w:p>
     <w:p>
@@ -404,31 +356,7 @@
         <w:ind w:left="708"/>
       </w:pPr>
       <w:r>
-        <w:t>NOTA: La ausencia de `</w:t>
-      </w:r>
-      <w:proofErr w:type="spellStart"/>
-      <w:r>
-        <w:t>ebikes</w:t>
-      </w:r>
-      <w:proofErr w:type="spellEnd"/>
-      <w:r>
-        <w:t xml:space="preserve">` no debe interpretarse como que la red carece de bicicletas eléctricas, el </w:t>
-      </w:r>
-      <w:proofErr w:type="spellStart"/>
-      <w:r>
-        <w:t>guión</w:t>
-      </w:r>
-      <w:proofErr w:type="spellEnd"/>
-      <w:r>
-        <w:t xml:space="preserve"> indica que el dato no está disponible se muestra un </w:t>
-      </w:r>
-      <w:proofErr w:type="spellStart"/>
-      <w:r>
-        <w:t>guión</w:t>
-      </w:r>
-      <w:proofErr w:type="spellEnd"/>
-      <w:r>
-        <w:t>. Un valor `false` sí indica que no dispone de ellas.</w:t>
+        <w:t>NOTA: La ausencia de `ebikes` no debe interpretarse como que la red carece de bicicletas eléctricas, el guión indica que el dato no está disponible se muestra un guión. Un valor `false` sí indica que no dispone de ellas.</w:t>
       </w:r>
     </w:p>
     <w:p>
@@ -458,23 +386,7 @@
         <w:spacing w:after="0" w:line="240" w:lineRule="auto"/>
       </w:pPr>
       <w:r>
-        <w:t>Contexto: Uno o más datos tienen un formato o valor inválido. Por ejemplo, las coordenadas están fuera de los rangos válidos (latitud entre -90 y 90, longitud entre -180 y 180), `</w:t>
-      </w:r>
-      <w:proofErr w:type="spellStart"/>
-      <w:r>
-        <w:t>ebikes</w:t>
-      </w:r>
-      <w:proofErr w:type="spellEnd"/>
-      <w:r>
-        <w:t>` no es un valor booleano o la lista `</w:t>
-      </w:r>
-      <w:proofErr w:type="spellStart"/>
-      <w:r>
-        <w:t>company</w:t>
-      </w:r>
-      <w:proofErr w:type="spellEnd"/>
-      <w:r>
-        <w:t>` contiene elementos vacíos o que no son nombres de empresa.</w:t>
+        <w:t>Contexto: Uno o más datos tienen un formato o valor inválido. Por ejemplo, las coordenadas están fuera de los rangos válidos (latitud entre -90 y 90, longitud entre -180 y 180), `ebikes` no es un valor booleano o la lista `company` contiene elementos vacíos o que no son nombres de empresa.</w:t>
       </w:r>
     </w:p>
     <w:p>
@@ -530,15 +442,7 @@
         <w:spacing w:after="0" w:line="240" w:lineRule="auto"/>
       </w:pPr>
       <w:r>
-        <w:t>La aplicación calcula el número de empresas operadoras de la red a partir de la lista `</w:t>
-      </w:r>
-      <w:proofErr w:type="spellStart"/>
-      <w:r>
-        <w:t>company</w:t>
-      </w:r>
-      <w:proofErr w:type="spellEnd"/>
-      <w:r>
-        <w:t>`.</w:t>
+        <w:t>La aplicación calcula el número de empresas operadoras de la red a partir de la lista `company`.</w:t>
       </w:r>
     </w:p>
     <w:p>
@@ -570,15 +474,7 @@
         <w:spacing w:after="0" w:line="240" w:lineRule="auto"/>
       </w:pPr>
       <w:r>
-        <w:t xml:space="preserve">Se verifica que para los datos con valores anómalos se muestra un </w:t>
-      </w:r>
-      <w:proofErr w:type="spellStart"/>
-      <w:r>
-        <w:t>guión</w:t>
-      </w:r>
-      <w:proofErr w:type="spellEnd"/>
-      <w:r>
-        <w:t>, indicando que el dato no está disponible, ya que hay un problema con ellos.</w:t>
+        <w:t>Se verifica que para los datos con valores anómalos se muestra un guión, indicando que el dato no está disponible, ya que hay un problema con ellos.</w:t>
       </w:r>
     </w:p>
     <w:p>
@@ -595,15 +491,7 @@
       </w:pPr>
       <w:r>
         <w:lastRenderedPageBreak/>
-        <w:t>Se verifica que el cálculo del número de empresas colaboradoras solo se realiza si `</w:t>
-      </w:r>
-      <w:proofErr w:type="spellStart"/>
-      <w:r>
-        <w:t>company</w:t>
-      </w:r>
-      <w:proofErr w:type="spellEnd"/>
-      <w:r>
-        <w:t>` está disponible y definida como un array de elementos de tipo texto.</w:t>
+        <w:t>Se verifica que el cálculo del número de empresas colaboradoras solo se realiza si `company` está disponible y definida como un array de elementos de tipo texto.</w:t>
       </w:r>
     </w:p>
     <w:p>
@@ -755,37 +643,14 @@
           <w:u w:val="single"/>
         </w:rPr>
       </w:pPr>
-      <w:proofErr w:type="spellStart"/>
-      <w:r>
-        <w:t>Metodo</w:t>
-      </w:r>
-      <w:proofErr w:type="spellEnd"/>
-      <w:r>
-        <w:t xml:space="preserve"> </w:t>
-      </w:r>
-      <w:proofErr w:type="spellStart"/>
-      <w:r>
-        <w:t>onCreate</w:t>
-      </w:r>
-      <w:proofErr w:type="spellEnd"/>
-      <w:r>
-        <w:t xml:space="preserve">() de la clase </w:t>
-      </w:r>
-      <w:proofErr w:type="spellStart"/>
+      <w:r>
+        <w:t xml:space="preserve">Metodo onCreate() de la clase </w:t>
+      </w:r>
       <w:r>
         <w:t>DetailsView</w:t>
       </w:r>
-      <w:proofErr w:type="spellEnd"/>
-      <w:r>
-        <w:t xml:space="preserve"> ya que ahora al crearse recoge la información de la red correspondiente y la asigna a los </w:t>
-      </w:r>
-      <w:proofErr w:type="spellStart"/>
-      <w:r>
-        <w:t>labels</w:t>
-      </w:r>
-      <w:proofErr w:type="spellEnd"/>
-      <w:r>
-        <w:t xml:space="preserve"> correspondientes para mostrarla</w:t>
+      <w:r>
+        <w:t xml:space="preserve"> ya que ahora al crearse recoge la información de la red correspondiente y la asigna a los labels correspondientes para mostrarla</w:t>
       </w:r>
     </w:p>
     <w:p>
@@ -840,7 +705,6 @@
       <w:r>
         <w:t xml:space="preserve">Método </w:t>
       </w:r>
-      <w:proofErr w:type="spellStart"/>
       <w:r>
         <w:t>on</w:t>
       </w:r>
@@ -848,17 +712,8 @@
         <w:t>C</w:t>
       </w:r>
       <w:r>
-        <w:t>reate</w:t>
-      </w:r>
-      <w:proofErr w:type="spellEnd"/>
-      <w:r>
-        <w:t xml:space="preserve"> de la clase </w:t>
-      </w:r>
-      <w:proofErr w:type="spellStart"/>
-      <w:r>
-        <w:t>DetailsView</w:t>
-      </w:r>
-      <w:proofErr w:type="spellEnd"/>
+        <w:t>reate de la clase DetailsView</w:t>
+      </w:r>
       <w:r>
         <w:t xml:space="preserve"> </w:t>
       </w:r>
@@ -950,21 +805,8 @@
           </w:tcPr>
           <w:p>
             <w:r>
-              <w:t xml:space="preserve">Se hace </w:t>
-            </w:r>
-            <w:proofErr w:type="spellStart"/>
-            <w:r>
-              <w:t>click</w:t>
-            </w:r>
-            <w:proofErr w:type="spellEnd"/>
-            <w:r>
-              <w:t xml:space="preserve"> </w:t>
-            </w:r>
-            <w:proofErr w:type="spellStart"/>
-            <w:r>
-              <w:t>Bicing</w:t>
-            </w:r>
-            <w:proofErr w:type="spellEnd"/>
+              <w:t>Se hace click Bicing</w:t>
+            </w:r>
           </w:p>
           <w:p>
             <w:r>
@@ -984,13 +826,8 @@
           </w:tcPr>
           <w:p>
             <w:r>
-              <w:t>(Nombre)</w:t>
-            </w:r>
-            <w:proofErr w:type="spellStart"/>
-            <w:r>
-              <w:t>Bicing</w:t>
-            </w:r>
-            <w:proofErr w:type="spellEnd"/>
+              <w:t>(Nombre)Bicing</w:t>
+            </w:r>
             <w:r>
               <w:t>,</w:t>
             </w:r>
@@ -1008,15 +845,7 @@
           </w:p>
           <w:p>
             <w:r>
-              <w:t>(</w:t>
-            </w:r>
-            <w:proofErr w:type="spellStart"/>
-            <w:r>
-              <w:t>ebikes</w:t>
-            </w:r>
-            <w:proofErr w:type="spellEnd"/>
-            <w:r>
-              <w:t xml:space="preserve">) </w:t>
+              <w:t xml:space="preserve">(ebikes) </w:t>
             </w:r>
             <w:r>
               <w:t>true</w:t>
@@ -1027,15 +856,7 @@
           </w:p>
           <w:p>
             <w:r>
-              <w:t>(</w:t>
-            </w:r>
-            <w:proofErr w:type="spellStart"/>
-            <w:r>
-              <w:t>NºCompañias</w:t>
-            </w:r>
-            <w:proofErr w:type="spellEnd"/>
-            <w:r>
-              <w:t>) 3</w:t>
+              <w:t>(NºCompañias) 3</w:t>
             </w:r>
             <w:r>
               <w:t>,</w:t>
@@ -1043,34 +864,10 @@
           </w:p>
           <w:p>
             <w:r>
-              <w:t>(</w:t>
-            </w:r>
-            <w:proofErr w:type="spellStart"/>
-            <w:r>
-              <w:t>Compañias</w:t>
-            </w:r>
-            <w:proofErr w:type="spellEnd"/>
-            <w:r>
-              <w:t>) {</w:t>
-            </w:r>
-            <w:r>
-              <w:t xml:space="preserve">“Barcelona de </w:t>
-            </w:r>
-            <w:proofErr w:type="spellStart"/>
-            <w:r>
-              <w:t>Serveis</w:t>
-            </w:r>
-            <w:proofErr w:type="spellEnd"/>
-            <w:r>
-              <w:t xml:space="preserve"> </w:t>
-            </w:r>
-            <w:proofErr w:type="spellStart"/>
-            <w:r>
-              <w:t>Municipals,S.A</w:t>
-            </w:r>
-            <w:proofErr w:type="spellEnd"/>
-            <w:r>
-              <w:t>.(BSM)”,</w:t>
+              <w:t>(Compañias) {</w:t>
+            </w:r>
+            <w:r>
+              <w:t>“Barcelona de Serveis Municipals,S.A.(BSM)”,</w:t>
             </w:r>
           </w:p>
           <w:p>
@@ -1108,21 +905,8 @@
           </w:tcPr>
           <w:p>
             <w:r>
-              <w:t xml:space="preserve">Se hace </w:t>
-            </w:r>
-            <w:proofErr w:type="spellStart"/>
-            <w:r>
-              <w:t>click</w:t>
-            </w:r>
-            <w:proofErr w:type="spellEnd"/>
-            <w:r>
-              <w:t xml:space="preserve"> en </w:t>
-            </w:r>
-            <w:proofErr w:type="spellStart"/>
-            <w:r>
-              <w:t>TUeBICI</w:t>
-            </w:r>
-            <w:proofErr w:type="spellEnd"/>
+              <w:t>Se hace click en TUeBICI</w:t>
+            </w:r>
           </w:p>
           <w:p>
             <w:r>
@@ -1147,11 +931,9 @@
             <w:r>
               <w:t>(Nombre)</w:t>
             </w:r>
-            <w:proofErr w:type="spellStart"/>
             <w:r>
               <w:t>TUeBICI</w:t>
             </w:r>
-            <w:proofErr w:type="spellEnd"/>
             <w:r>
               <w:t>,</w:t>
             </w:r>
@@ -1175,15 +957,7 @@
               <w:t>El resto de cam</w:t>
             </w:r>
             <w:r>
-              <w:t>pos se muestra un mensaje de “</w:t>
-            </w:r>
-            <w:proofErr w:type="spellStart"/>
-            <w:r>
-              <w:t>noData</w:t>
-            </w:r>
-            <w:proofErr w:type="spellEnd"/>
-            <w:r>
-              <w:t>”</w:t>
+              <w:t>pos se muestra un mensaje de “noData”</w:t>
             </w:r>
           </w:p>
           <w:p/>
@@ -1214,15 +988,7 @@
           </w:tcPr>
           <w:p>
             <w:r>
-              <w:t xml:space="preserve">Se hace </w:t>
-            </w:r>
-            <w:proofErr w:type="spellStart"/>
-            <w:r>
-              <w:t>click</w:t>
-            </w:r>
-            <w:proofErr w:type="spellEnd"/>
-            <w:r>
-              <w:t xml:space="preserve"> en cualquiera</w:t>
+              <w:t>Se hace click en cualquiera</w:t>
             </w:r>
           </w:p>
           <w:p>
@@ -1240,13 +1006,8 @@
               <w:t xml:space="preserve">Se muestra un mensaje de error al </w:t>
             </w:r>
             <w:r>
-              <w:t xml:space="preserve">cargar la </w:t>
-            </w:r>
-            <w:proofErr w:type="spellStart"/>
-            <w:r>
-              <w:t>network</w:t>
-            </w:r>
-            <w:proofErr w:type="spellEnd"/>
+              <w:t>cargar la network</w:t>
+            </w:r>
           </w:p>
         </w:tc>
       </w:tr>
@@ -1278,44 +1039,18 @@
               <w:t xml:space="preserve">Se </w:t>
             </w:r>
             <w:r>
-              <w:t xml:space="preserve">hace </w:t>
-            </w:r>
-            <w:proofErr w:type="spellStart"/>
-            <w:r>
-              <w:t>click</w:t>
-            </w:r>
-            <w:proofErr w:type="spellEnd"/>
-            <w:r>
-              <w:t xml:space="preserve"> en </w:t>
-            </w:r>
-            <w:proofErr w:type="spellStart"/>
+              <w:t xml:space="preserve">hace click en </w:t>
+            </w:r>
             <w:r>
               <w:t>BiciMAD</w:t>
             </w:r>
-            <w:proofErr w:type="spellEnd"/>
           </w:p>
           <w:p>
             <w:r>
-              <w:t xml:space="preserve">(Datos </w:t>
-            </w:r>
-            <w:proofErr w:type="spellStart"/>
-            <w:r>
-              <w:t>Incosistentes</w:t>
-            </w:r>
-            <w:proofErr w:type="spellEnd"/>
-            <w:r>
-              <w:t>,</w:t>
-            </w:r>
-            <w:r>
-              <w:t xml:space="preserve"> </w:t>
-            </w:r>
-            <w:proofErr w:type="spellStart"/>
-            <w:r>
-              <w:t>ebikes</w:t>
-            </w:r>
-            <w:proofErr w:type="spellEnd"/>
-            <w:r>
-              <w:t xml:space="preserve"> no es booleano</w:t>
+              <w:t>(Datos Incosistentes,</w:t>
+            </w:r>
+            <w:r>
+              <w:t xml:space="preserve"> ebikes no es booleano</w:t>
             </w:r>
             <w:r>
               <w:t>)</w:t>
@@ -1384,15 +1119,7 @@
         <w:jc w:val="both"/>
       </w:pPr>
       <w:r>
-        <w:t xml:space="preserve">Detectada en la prueba unitaria PU-03 la falta de un </w:t>
-      </w:r>
-      <w:proofErr w:type="spellStart"/>
-      <w:r>
-        <w:t>toast</w:t>
-      </w:r>
-      <w:proofErr w:type="spellEnd"/>
-      <w:r>
-        <w:t xml:space="preserve"> con mensaje de error de red, todas las demás pruebas unitarias pasan sin problema.</w:t>
+        <w:t>Detectada en la prueba unitaria PU-03 la falta de un toast con mensaje de error de red, todas las demás pruebas unitarias pasan sin problema.</w:t>
       </w:r>
     </w:p>
     <w:p>
@@ -1402,6 +1129,19 @@
       </w:pPr>
       <w:r>
         <w:t>No se han detectado fallos en las pruebas de integración.</w:t>
+      </w:r>
+    </w:p>
+    <w:p>
+      <w:pPr>
+        <w:spacing w:after="120"/>
+        <w:jc w:val="both"/>
+      </w:pPr>
+      <w:r>
+        <w:t xml:space="preserve">Durante la ejecución de las pruebas de interfaz, se detecto un error que podría llegar a causar problemas a lo largo del desarrollo. La introducción de una ListView dentro de una tabla puede llegar a generar bucles infinitos al tratar de obtener información mediante métodos onView() o </w:t>
+      </w:r>
+      <w:r>
+        <w:lastRenderedPageBreak/>
+        <w:t>similares. Por lo que se decidió mover la ListView que mostraba las estaciones fuera de la tabla. Tras solucionar eso, los test de interfaz pasaron exitosamente.</w:t>
       </w:r>
     </w:p>
     <w:p>
@@ -2748,6 +2488,7 @@
   <w:style w:type="character" w:default="1" w:styleId="Fuentedeprrafopredeter">
     <w:name w:val="Default Paragraph Font"/>
     <w:uiPriority w:val="1"/>
+    <w:semiHidden/>
     <w:unhideWhenUsed/>
   </w:style>
   <w:style w:type="table" w:default="1" w:styleId="Tablanormal">

</xml_diff>